<commit_message>
added databasse migration ,corrected sign_up endpoint, updated the users routes
</commit_message>
<xml_diff>
--- a/strucutre.docx
+++ b/strucutre.docx
@@ -3,8 +3,13 @@
 <w:document xmlns:wpc="http://schemas.microsoft.com/office/word/2010/wordprocessingCanvas" xmlns:cx="http://schemas.microsoft.com/office/drawing/2014/chartex" xmlns:cx1="http://schemas.microsoft.com/office/drawing/2015/9/8/chartex" xmlns:cx2="http://schemas.microsoft.com/office/drawing/2015/10/21/chartex" xmlns:cx3="http://schemas.microsoft.com/office/drawing/2016/5/9/chartex" xmlns:cx4="http://schemas.microsoft.com/office/drawing/2016/5/10/chartex" xmlns:cx5="http://schemas.microsoft.com/office/drawing/2016/5/11/chartex" xmlns:cx6="http://schemas.microsoft.com/office/drawing/2016/5/12/chartex" xmlns:cx7="http://schemas.microsoft.com/office/drawing/2016/5/13/chartex" xmlns:cx8="http://schemas.microsoft.com/office/drawing/2016/5/14/chartex" xmlns:mc="http://schemas.openxmlformats.org/markup-compatibility/2006" xmlns:aink="http://schemas.microsoft.com/office/drawing/2016/ink" xmlns:am3d="http://schemas.microsoft.com/office/drawing/2017/model3d" xmlns:o="urn:schemas-microsoft-com:office:office" xmlns:oel="http://schemas.microsoft.com/office/2019/extlst" xmlns:r="http://schemas.openxmlformats.org/officeDocument/2006/relationships" xmlns:m="http://schemas.openxmlformats.org/officeDocument/2006/math" xmlns:v="urn:schemas-microsoft-com:vml" xmlns:wp14="http://schemas.microsoft.com/office/word/2010/wordprocessingDrawing" xmlns:wp="http://schemas.openxmlformats.org/drawingml/2006/wordprocessingDrawing" xmlns:w10="urn:schemas-microsoft-com:office:word" xmlns:w="http://schemas.openxmlformats.org/wordprocessingml/2006/main" xmlns:w14="http://schemas.microsoft.com/office/word/2010/wordml" xmlns:w15="http://schemas.microsoft.com/office/word/2012/wordml" xmlns:w16cex="http://schemas.microsoft.com/office/word/2018/wordml/cex" xmlns:w16cid="http://schemas.microsoft.com/office/word/2016/wordml/cid" xmlns:w16="http://schemas.microsoft.com/office/word/2018/wordml" xmlns:w16du="http://schemas.microsoft.com/office/word/2023/wordml/word16du" xmlns:w16sdtdh="http://schemas.microsoft.com/office/word/2020/wordml/sdtdatahash" xmlns:w16sdtfl="http://schemas.microsoft.com/office/word/2024/wordml/sdtformatlock" xmlns:w16se="http://schemas.microsoft.com/office/word/2015/wordml/symex" xmlns:wpg="http://schemas.microsoft.com/office/word/2010/wordprocessingGroup" xmlns:wpi="http://schemas.microsoft.com/office/word/2010/wordprocessingInk" xmlns:wne="http://schemas.microsoft.com/office/word/2006/wordml" xmlns:wps="http://schemas.microsoft.com/office/word/2010/wordprocessingShape" mc:Ignorable="w14 w15 w16se w16cid w16 w16cex w16sdtdh w16sdtfl w16du wp14">
   <w:body>
     <w:p>
-      <w:r>
-        <w:t>api/</w:t>
+      <w:proofErr w:type="spellStart"/>
+      <w:r>
+        <w:t>api</w:t>
+      </w:r>
+      <w:proofErr w:type="spellEnd"/>
+      <w:r>
+        <w:t>/</w:t>
       </w:r>
     </w:p>
     <w:p>
@@ -60,7 +65,15 @@
         <w:t>──</w:t>
       </w:r>
       <w:r>
-        <w:t xml:space="preserve"> technologies/         # Python, Docker, Redis, FastAPI, AWS...</w:t>
+        <w:t xml:space="preserve"> technologies/         # Python, Docker, Redis, </w:t>
+      </w:r>
+      <w:proofErr w:type="spellStart"/>
+      <w:r>
+        <w:t>FastAPI</w:t>
+      </w:r>
+      <w:proofErr w:type="spellEnd"/>
+      <w:r>
+        <w:t>, AWS...</w:t>
       </w:r>
     </w:p>
     <w:p>
@@ -321,6 +334,788 @@
     <w:p>
       <w:r>
         <w:t>└── analytics/            # Dashboard &amp; learning statistics</w:t>
+      </w:r>
+    </w:p>
+    <w:p/>
+    <w:p/>
+    <w:p/>
+    <w:p>
+      <w:r>
+        <w:t>developer-learning-hub/</w:t>
+      </w:r>
+    </w:p>
+    <w:p/>
+    <w:p>
+      <w:r>
+        <w:rPr>
+          <w:rFonts w:ascii="MS Gothic" w:eastAsia="MS Gothic" w:hAnsi="MS Gothic" w:cs="MS Gothic" w:hint="eastAsia"/>
+        </w:rPr>
+        <w:t>├</w:t>
+      </w:r>
+      <w:r>
+        <w:rPr>
+          <w:rFonts w:ascii="Calibri" w:hAnsi="Calibri" w:cs="Calibri"/>
+        </w:rPr>
+        <w:t>──</w:t>
+      </w:r>
+      <w:r>
+        <w:t xml:space="preserve"> </w:t>
+      </w:r>
+      <w:proofErr w:type="spellStart"/>
+      <w:r>
+        <w:t>src</w:t>
+      </w:r>
+      <w:proofErr w:type="spellEnd"/>
+      <w:r>
+        <w:t>/</w:t>
+      </w:r>
+    </w:p>
+    <w:p>
+      <w:r>
+        <w:t>│</w:t>
+      </w:r>
+    </w:p>
+    <w:p>
+      <w:r>
+        <w:t xml:space="preserve">│   </w:t>
+      </w:r>
+    </w:p>
+    <w:p>
+      <w:r>
+        <w:t>│   │</w:t>
+      </w:r>
+    </w:p>
+    <w:p>
+      <w:r>
+        <w:lastRenderedPageBreak/>
+        <w:t xml:space="preserve">│   </w:t>
+      </w:r>
+      <w:r>
+        <w:rPr>
+          <w:rFonts w:ascii="MS Gothic" w:eastAsia="MS Gothic" w:hAnsi="MS Gothic" w:cs="MS Gothic" w:hint="eastAsia"/>
+        </w:rPr>
+        <w:t>├</w:t>
+      </w:r>
+      <w:r>
+        <w:rPr>
+          <w:rFonts w:ascii="Calibri" w:hAnsi="Calibri" w:cs="Calibri"/>
+        </w:rPr>
+        <w:t>──</w:t>
+      </w:r>
+      <w:r>
+        <w:t xml:space="preserve"> core/</w:t>
+      </w:r>
+    </w:p>
+    <w:p>
+      <w:r>
+        <w:t xml:space="preserve">│   │   </w:t>
+      </w:r>
+      <w:r>
+        <w:rPr>
+          <w:rFonts w:ascii="MS Gothic" w:eastAsia="MS Gothic" w:hAnsi="MS Gothic" w:cs="MS Gothic" w:hint="eastAsia"/>
+        </w:rPr>
+        <w:t>├</w:t>
+      </w:r>
+      <w:r>
+        <w:rPr>
+          <w:rFonts w:ascii="Calibri" w:hAnsi="Calibri" w:cs="Calibri"/>
+        </w:rPr>
+        <w:t>──</w:t>
+      </w:r>
+      <w:r>
+        <w:t xml:space="preserve"> config.py</w:t>
+      </w:r>
+    </w:p>
+    <w:p>
+      <w:r>
+        <w:t xml:space="preserve">│   │   </w:t>
+      </w:r>
+      <w:r>
+        <w:rPr>
+          <w:rFonts w:ascii="MS Gothic" w:eastAsia="MS Gothic" w:hAnsi="MS Gothic" w:cs="MS Gothic" w:hint="eastAsia"/>
+        </w:rPr>
+        <w:t>├</w:t>
+      </w:r>
+      <w:r>
+        <w:rPr>
+          <w:rFonts w:ascii="Calibri" w:hAnsi="Calibri" w:cs="Calibri"/>
+        </w:rPr>
+        <w:t>──</w:t>
+      </w:r>
+      <w:r>
+        <w:t xml:space="preserve"> security.py</w:t>
+      </w:r>
+    </w:p>
+    <w:p>
+      <w:r>
+        <w:t xml:space="preserve">│   │   </w:t>
+      </w:r>
+      <w:r>
+        <w:rPr>
+          <w:rFonts w:ascii="MS Gothic" w:eastAsia="MS Gothic" w:hAnsi="MS Gothic" w:cs="MS Gothic" w:hint="eastAsia"/>
+        </w:rPr>
+        <w:t>├</w:t>
+      </w:r>
+      <w:r>
+        <w:rPr>
+          <w:rFonts w:ascii="Calibri" w:hAnsi="Calibri" w:cs="Calibri"/>
+        </w:rPr>
+        <w:t>──</w:t>
+      </w:r>
+      <w:r>
+        <w:t xml:space="preserve"> jwt.py</w:t>
+      </w:r>
+    </w:p>
+    <w:p>
+      <w:r>
+        <w:t xml:space="preserve">│   │   </w:t>
+      </w:r>
+      <w:r>
+        <w:rPr>
+          <w:rFonts w:ascii="MS Gothic" w:eastAsia="MS Gothic" w:hAnsi="MS Gothic" w:cs="MS Gothic" w:hint="eastAsia"/>
+        </w:rPr>
+        <w:t>├</w:t>
+      </w:r>
+      <w:r>
+        <w:rPr>
+          <w:rFonts w:ascii="Calibri" w:hAnsi="Calibri" w:cs="Calibri"/>
+        </w:rPr>
+        <w:t>──</w:t>
+      </w:r>
+      <w:r>
+        <w:t xml:space="preserve"> logging.py</w:t>
+      </w:r>
+    </w:p>
+    <w:p>
+      <w:r>
+        <w:t xml:space="preserve">│   │   </w:t>
+      </w:r>
+      <w:r>
+        <w:rPr>
+          <w:rFonts w:ascii="MS Gothic" w:eastAsia="MS Gothic" w:hAnsi="MS Gothic" w:cs="MS Gothic" w:hint="eastAsia"/>
+        </w:rPr>
+        <w:t>├</w:t>
+      </w:r>
+      <w:r>
+        <w:rPr>
+          <w:rFonts w:ascii="Calibri" w:hAnsi="Calibri" w:cs="Calibri"/>
+        </w:rPr>
+        <w:t>──</w:t>
+      </w:r>
+      <w:r>
+        <w:t xml:space="preserve"> exceptions.py</w:t>
+      </w:r>
+    </w:p>
+    <w:p>
+      <w:r>
+        <w:t>│   │   └── settings.py</w:t>
+      </w:r>
+    </w:p>
+    <w:p>
+      <w:r>
+        <w:t>│   │</w:t>
+      </w:r>
+    </w:p>
+    <w:p>
+      <w:r>
+        <w:t xml:space="preserve">│   </w:t>
+      </w:r>
+      <w:r>
+        <w:rPr>
+          <w:rFonts w:ascii="MS Gothic" w:eastAsia="MS Gothic" w:hAnsi="MS Gothic" w:cs="MS Gothic" w:hint="eastAsia"/>
+        </w:rPr>
+        <w:t>├</w:t>
+      </w:r>
+      <w:r>
+        <w:rPr>
+          <w:rFonts w:ascii="Calibri" w:hAnsi="Calibri" w:cs="Calibri"/>
+        </w:rPr>
+        <w:t>──</w:t>
+      </w:r>
+      <w:r>
+        <w:t xml:space="preserve"> database/</w:t>
+      </w:r>
+    </w:p>
+    <w:p>
+      <w:r>
+        <w:t xml:space="preserve">│   │   </w:t>
+      </w:r>
+      <w:r>
+        <w:rPr>
+          <w:rFonts w:ascii="MS Gothic" w:eastAsia="MS Gothic" w:hAnsi="MS Gothic" w:cs="MS Gothic" w:hint="eastAsia"/>
+        </w:rPr>
+        <w:t>├</w:t>
+      </w:r>
+      <w:r>
+        <w:rPr>
+          <w:rFonts w:ascii="Calibri" w:hAnsi="Calibri" w:cs="Calibri"/>
+        </w:rPr>
+        <w:t>──</w:t>
+      </w:r>
+      <w:r>
+        <w:t xml:space="preserve"> base.py</w:t>
+      </w:r>
+    </w:p>
+    <w:p>
+      <w:r>
+        <w:t xml:space="preserve">│   │   </w:t>
+      </w:r>
+      <w:r>
+        <w:rPr>
+          <w:rFonts w:ascii="MS Gothic" w:eastAsia="MS Gothic" w:hAnsi="MS Gothic" w:cs="MS Gothic" w:hint="eastAsia"/>
+        </w:rPr>
+        <w:t>├</w:t>
+      </w:r>
+      <w:r>
+        <w:rPr>
+          <w:rFonts w:ascii="Calibri" w:hAnsi="Calibri" w:cs="Calibri"/>
+        </w:rPr>
+        <w:t>──</w:t>
+      </w:r>
+      <w:r>
+        <w:t xml:space="preserve"> session.py</w:t>
+      </w:r>
+    </w:p>
+    <w:p>
+      <w:r>
+        <w:t>│   │   └── database.py</w:t>
+      </w:r>
+    </w:p>
+    <w:p>
+      <w:r>
+        <w:t>│   │</w:t>
+      </w:r>
+    </w:p>
+    <w:p>
+      <w:r>
+        <w:t xml:space="preserve">│   </w:t>
+      </w:r>
+      <w:r>
+        <w:rPr>
+          <w:rFonts w:ascii="MS Gothic" w:eastAsia="MS Gothic" w:hAnsi="MS Gothic" w:cs="MS Gothic" w:hint="eastAsia"/>
+        </w:rPr>
+        <w:t>├</w:t>
+      </w:r>
+      <w:r>
+        <w:rPr>
+          <w:rFonts w:ascii="Calibri" w:hAnsi="Calibri" w:cs="Calibri"/>
+        </w:rPr>
+        <w:t>──</w:t>
+      </w:r>
+      <w:r>
+        <w:t xml:space="preserve"> </w:t>
+      </w:r>
+      <w:proofErr w:type="spellStart"/>
+      <w:r>
+        <w:t>redis</w:t>
+      </w:r>
+      <w:proofErr w:type="spellEnd"/>
+      <w:r>
+        <w:t>/</w:t>
+      </w:r>
+    </w:p>
+    <w:p>
+      <w:r>
+        <w:t xml:space="preserve">│   │   </w:t>
+      </w:r>
+      <w:r>
+        <w:rPr>
+          <w:rFonts w:ascii="MS Gothic" w:eastAsia="MS Gothic" w:hAnsi="MS Gothic" w:cs="MS Gothic" w:hint="eastAsia"/>
+        </w:rPr>
+        <w:t>├</w:t>
+      </w:r>
+      <w:r>
+        <w:rPr>
+          <w:rFonts w:ascii="Calibri" w:hAnsi="Calibri" w:cs="Calibri"/>
+        </w:rPr>
+        <w:t>──</w:t>
+      </w:r>
+      <w:r>
+        <w:t xml:space="preserve"> client.py</w:t>
+      </w:r>
+    </w:p>
+    <w:p>
+      <w:r>
+        <w:t xml:space="preserve">│   │   </w:t>
+      </w:r>
+      <w:r>
+        <w:rPr>
+          <w:rFonts w:ascii="MS Gothic" w:eastAsia="MS Gothic" w:hAnsi="MS Gothic" w:cs="MS Gothic" w:hint="eastAsia"/>
+        </w:rPr>
+        <w:t>├</w:t>
+      </w:r>
+      <w:r>
+        <w:rPr>
+          <w:rFonts w:ascii="Calibri" w:hAnsi="Calibri" w:cs="Calibri"/>
+        </w:rPr>
+        <w:t>──</w:t>
+      </w:r>
+      <w:r>
+        <w:t xml:space="preserve"> cache.py</w:t>
+      </w:r>
+    </w:p>
+    <w:p>
+      <w:r>
+        <w:t xml:space="preserve">│   │   </w:t>
+      </w:r>
+      <w:r>
+        <w:rPr>
+          <w:rFonts w:ascii="MS Gothic" w:eastAsia="MS Gothic" w:hAnsi="MS Gothic" w:cs="MS Gothic" w:hint="eastAsia"/>
+        </w:rPr>
+        <w:t>├</w:t>
+      </w:r>
+      <w:r>
+        <w:rPr>
+          <w:rFonts w:ascii="Calibri" w:hAnsi="Calibri" w:cs="Calibri"/>
+        </w:rPr>
+        <w:t>──</w:t>
+      </w:r>
+      <w:r>
+        <w:t xml:space="preserve"> blacklist.py</w:t>
+      </w:r>
+    </w:p>
+    <w:p>
+      <w:r>
+        <w:t>│   │   └── pubsub.py</w:t>
+      </w:r>
+    </w:p>
+    <w:p>
+      <w:r>
+        <w:t>│   │</w:t>
+      </w:r>
+    </w:p>
+    <w:p>
+      <w:r>
+        <w:t xml:space="preserve">│   </w:t>
+      </w:r>
+      <w:r>
+        <w:rPr>
+          <w:rFonts w:ascii="MS Gothic" w:eastAsia="MS Gothic" w:hAnsi="MS Gothic" w:cs="MS Gothic" w:hint="eastAsia"/>
+        </w:rPr>
+        <w:t>├</w:t>
+      </w:r>
+      <w:r>
+        <w:rPr>
+          <w:rFonts w:ascii="Calibri" w:hAnsi="Calibri" w:cs="Calibri"/>
+        </w:rPr>
+        <w:t>──</w:t>
+      </w:r>
+      <w:r>
+        <w:t xml:space="preserve"> middleware/</w:t>
+      </w:r>
+    </w:p>
+    <w:p>
+      <w:r>
+        <w:t xml:space="preserve">│   │   </w:t>
+      </w:r>
+      <w:r>
+        <w:rPr>
+          <w:rFonts w:ascii="MS Gothic" w:eastAsia="MS Gothic" w:hAnsi="MS Gothic" w:cs="MS Gothic" w:hint="eastAsia"/>
+        </w:rPr>
+        <w:t>├</w:t>
+      </w:r>
+      <w:r>
+        <w:rPr>
+          <w:rFonts w:ascii="Calibri" w:hAnsi="Calibri" w:cs="Calibri"/>
+        </w:rPr>
+        <w:t>──</w:t>
+      </w:r>
+      <w:r>
+        <w:t xml:space="preserve"> auth.py</w:t>
+      </w:r>
+    </w:p>
+    <w:p>
+      <w:r>
+        <w:t xml:space="preserve">│   │   </w:t>
+      </w:r>
+      <w:r>
+        <w:rPr>
+          <w:rFonts w:ascii="MS Gothic" w:eastAsia="MS Gothic" w:hAnsi="MS Gothic" w:cs="MS Gothic" w:hint="eastAsia"/>
+        </w:rPr>
+        <w:t>├</w:t>
+      </w:r>
+      <w:r>
+        <w:rPr>
+          <w:rFonts w:ascii="Calibri" w:hAnsi="Calibri" w:cs="Calibri"/>
+        </w:rPr>
+        <w:t>──</w:t>
+      </w:r>
+      <w:r>
+        <w:t xml:space="preserve"> logging.py</w:t>
+      </w:r>
+    </w:p>
+    <w:p>
+      <w:r>
+        <w:t xml:space="preserve">│   │   </w:t>
+      </w:r>
+      <w:r>
+        <w:rPr>
+          <w:rFonts w:ascii="MS Gothic" w:eastAsia="MS Gothic" w:hAnsi="MS Gothic" w:cs="MS Gothic" w:hint="eastAsia"/>
+        </w:rPr>
+        <w:t>├</w:t>
+      </w:r>
+      <w:r>
+        <w:rPr>
+          <w:rFonts w:ascii="Calibri" w:hAnsi="Calibri" w:cs="Calibri"/>
+        </w:rPr>
+        <w:t>──</w:t>
+      </w:r>
+      <w:r>
+        <w:t xml:space="preserve"> rate_limit.py</w:t>
+      </w:r>
+    </w:p>
+    <w:p>
+      <w:r>
+        <w:t>│   │   └── cors.py</w:t>
+      </w:r>
+    </w:p>
+    <w:p>
+      <w:r>
+        <w:t>│   │</w:t>
+      </w:r>
+    </w:p>
+    <w:p>
+      <w:r>
+        <w:t xml:space="preserve">│   </w:t>
+      </w:r>
+      <w:r>
+        <w:rPr>
+          <w:rFonts w:ascii="MS Gothic" w:eastAsia="MS Gothic" w:hAnsi="MS Gothic" w:cs="MS Gothic" w:hint="eastAsia"/>
+        </w:rPr>
+        <w:t>├</w:t>
+      </w:r>
+      <w:r>
+        <w:rPr>
+          <w:rFonts w:ascii="Calibri" w:hAnsi="Calibri" w:cs="Calibri"/>
+        </w:rPr>
+        <w:t>──</w:t>
+      </w:r>
+      <w:r>
+        <w:t xml:space="preserve"> common/</w:t>
+      </w:r>
+    </w:p>
+    <w:p>
+      <w:r>
+        <w:t xml:space="preserve">│   │   </w:t>
+      </w:r>
+      <w:r>
+        <w:rPr>
+          <w:rFonts w:ascii="MS Gothic" w:eastAsia="MS Gothic" w:hAnsi="MS Gothic" w:cs="MS Gothic" w:hint="eastAsia"/>
+        </w:rPr>
+        <w:t>├</w:t>
+      </w:r>
+      <w:r>
+        <w:rPr>
+          <w:rFonts w:ascii="Calibri" w:hAnsi="Calibri" w:cs="Calibri"/>
+        </w:rPr>
+        <w:t>──</w:t>
+      </w:r>
+      <w:r>
+        <w:t xml:space="preserve"> dependencies.py</w:t>
+      </w:r>
+    </w:p>
+    <w:p>
+      <w:r>
+        <w:t xml:space="preserve">│   │   </w:t>
+      </w:r>
+      <w:r>
+        <w:rPr>
+          <w:rFonts w:ascii="MS Gothic" w:eastAsia="MS Gothic" w:hAnsi="MS Gothic" w:cs="MS Gothic" w:hint="eastAsia"/>
+        </w:rPr>
+        <w:t>├</w:t>
+      </w:r>
+      <w:r>
+        <w:rPr>
+          <w:rFonts w:ascii="Calibri" w:hAnsi="Calibri" w:cs="Calibri"/>
+        </w:rPr>
+        <w:t>──</w:t>
+      </w:r>
+      <w:r>
+        <w:t xml:space="preserve"> pagination.py</w:t>
+      </w:r>
+    </w:p>
+    <w:p>
+      <w:r>
+        <w:t xml:space="preserve">│   │   </w:t>
+      </w:r>
+      <w:r>
+        <w:rPr>
+          <w:rFonts w:ascii="MS Gothic" w:eastAsia="MS Gothic" w:hAnsi="MS Gothic" w:cs="MS Gothic" w:hint="eastAsia"/>
+        </w:rPr>
+        <w:t>├</w:t>
+      </w:r>
+      <w:r>
+        <w:rPr>
+          <w:rFonts w:ascii="Calibri" w:hAnsi="Calibri" w:cs="Calibri"/>
+        </w:rPr>
+        <w:t>──</w:t>
+      </w:r>
+      <w:r>
+        <w:t xml:space="preserve"> permissions.py</w:t>
+      </w:r>
+    </w:p>
+    <w:p>
+      <w:r>
+        <w:t xml:space="preserve">│   │   </w:t>
+      </w:r>
+      <w:r>
+        <w:rPr>
+          <w:rFonts w:ascii="MS Gothic" w:eastAsia="MS Gothic" w:hAnsi="MS Gothic" w:cs="MS Gothic" w:hint="eastAsia"/>
+        </w:rPr>
+        <w:t>├</w:t>
+      </w:r>
+      <w:r>
+        <w:rPr>
+          <w:rFonts w:ascii="Calibri" w:hAnsi="Calibri" w:cs="Calibri"/>
+        </w:rPr>
+        <w:t>──</w:t>
+      </w:r>
+      <w:r>
+        <w:t xml:space="preserve"> responses.py</w:t>
+      </w:r>
+    </w:p>
+    <w:p>
+      <w:r>
+        <w:lastRenderedPageBreak/>
+        <w:t>│   │   └── constants.py</w:t>
+      </w:r>
+    </w:p>
+    <w:p>
+      <w:r>
+        <w:t>│   │</w:t>
+      </w:r>
+    </w:p>
+    <w:p>
+      <w:r>
+        <w:t xml:space="preserve">│   </w:t>
+      </w:r>
+      <w:r>
+        <w:rPr>
+          <w:rFonts w:ascii="MS Gothic" w:eastAsia="MS Gothic" w:hAnsi="MS Gothic" w:cs="MS Gothic" w:hint="eastAsia"/>
+        </w:rPr>
+        <w:t>├</w:t>
+      </w:r>
+      <w:r>
+        <w:rPr>
+          <w:rFonts w:ascii="Calibri" w:hAnsi="Calibri" w:cs="Calibri"/>
+        </w:rPr>
+        <w:t>──</w:t>
+      </w:r>
+      <w:r>
+        <w:t xml:space="preserve"> utils/</w:t>
+      </w:r>
+    </w:p>
+    <w:p>
+      <w:r>
+        <w:t xml:space="preserve">│   │   </w:t>
+      </w:r>
+      <w:r>
+        <w:rPr>
+          <w:rFonts w:ascii="MS Gothic" w:eastAsia="MS Gothic" w:hAnsi="MS Gothic" w:cs="MS Gothic" w:hint="eastAsia"/>
+        </w:rPr>
+        <w:t>├</w:t>
+      </w:r>
+      <w:r>
+        <w:rPr>
+          <w:rFonts w:ascii="Calibri" w:hAnsi="Calibri" w:cs="Calibri"/>
+        </w:rPr>
+        <w:t>──</w:t>
+      </w:r>
+      <w:r>
+        <w:t xml:space="preserve"> helpers.py</w:t>
+      </w:r>
+    </w:p>
+    <w:p>
+      <w:r>
+        <w:t xml:space="preserve">│   │   </w:t>
+      </w:r>
+      <w:r>
+        <w:rPr>
+          <w:rFonts w:ascii="MS Gothic" w:eastAsia="MS Gothic" w:hAnsi="MS Gothic" w:cs="MS Gothic" w:hint="eastAsia"/>
+        </w:rPr>
+        <w:t>├</w:t>
+      </w:r>
+      <w:r>
+        <w:rPr>
+          <w:rFonts w:ascii="Calibri" w:hAnsi="Calibri" w:cs="Calibri"/>
+        </w:rPr>
+        <w:t>──</w:t>
+      </w:r>
+      <w:r>
+        <w:t xml:space="preserve"> validators.py</w:t>
+      </w:r>
+    </w:p>
+    <w:p>
+      <w:r>
+        <w:t xml:space="preserve">│   │   </w:t>
+      </w:r>
+      <w:r>
+        <w:rPr>
+          <w:rFonts w:ascii="MS Gothic" w:eastAsia="MS Gothic" w:hAnsi="MS Gothic" w:cs="MS Gothic" w:hint="eastAsia"/>
+        </w:rPr>
+        <w:t>├</w:t>
+      </w:r>
+      <w:r>
+        <w:rPr>
+          <w:rFonts w:ascii="Calibri" w:hAnsi="Calibri" w:cs="Calibri"/>
+        </w:rPr>
+        <w:t>──</w:t>
+      </w:r>
+      <w:r>
+        <w:t xml:space="preserve"> file_upload.py</w:t>
+      </w:r>
+    </w:p>
+    <w:p>
+      <w:r>
+        <w:t>│   │   └── email.py</w:t>
+      </w:r>
+    </w:p>
+    <w:p>
+      <w:r>
+        <w:t>│   │</w:t>
+      </w:r>
+    </w:p>
+    <w:p>
+      <w:r>
+        <w:t xml:space="preserve">│   </w:t>
+      </w:r>
+      <w:r>
+        <w:rPr>
+          <w:rFonts w:ascii="MS Gothic" w:eastAsia="MS Gothic" w:hAnsi="MS Gothic" w:cs="MS Gothic" w:hint="eastAsia"/>
+        </w:rPr>
+        <w:t>├</w:t>
+      </w:r>
+      <w:r>
+        <w:rPr>
+          <w:rFonts w:ascii="Calibri" w:hAnsi="Calibri" w:cs="Calibri"/>
+        </w:rPr>
+        <w:t>──</w:t>
+      </w:r>
+      <w:r>
+        <w:t xml:space="preserve"> tests/</w:t>
+      </w:r>
+    </w:p>
+    <w:p>
+      <w:r>
+        <w:t>│   │</w:t>
+      </w:r>
+    </w:p>
+    <w:p>
+      <w:r>
+        <w:t>│   └── main.py</w:t>
+      </w:r>
+    </w:p>
+    <w:p>
+      <w:r>
+        <w:t>│</w:t>
+      </w:r>
+    </w:p>
+    <w:p>
+      <w:r>
+        <w:rPr>
+          <w:rFonts w:ascii="MS Gothic" w:eastAsia="MS Gothic" w:hAnsi="MS Gothic" w:cs="MS Gothic" w:hint="eastAsia"/>
+        </w:rPr>
+        <w:t>├</w:t>
+      </w:r>
+      <w:r>
+        <w:rPr>
+          <w:rFonts w:ascii="Calibri" w:hAnsi="Calibri" w:cs="Calibri"/>
+        </w:rPr>
+        <w:t>──</w:t>
+      </w:r>
+      <w:r>
+        <w:t xml:space="preserve"> alembic/</w:t>
+      </w:r>
+    </w:p>
+    <w:p>
+      <w:r>
+        <w:rPr>
+          <w:rFonts w:ascii="MS Gothic" w:eastAsia="MS Gothic" w:hAnsi="MS Gothic" w:cs="MS Gothic" w:hint="eastAsia"/>
+        </w:rPr>
+        <w:t>├</w:t>
+      </w:r>
+      <w:r>
+        <w:rPr>
+          <w:rFonts w:ascii="Calibri" w:hAnsi="Calibri" w:cs="Calibri"/>
+        </w:rPr>
+        <w:t>─</w:t>
+      </w:r>
+      <w:proofErr w:type="gramStart"/>
+      <w:r>
+        <w:rPr>
+          <w:rFonts w:ascii="Calibri" w:hAnsi="Calibri" w:cs="Calibri"/>
+        </w:rPr>
+        <w:t>─</w:t>
+      </w:r>
+      <w:r>
+        <w:t xml:space="preserve"> .env</w:t>
+      </w:r>
+      <w:proofErr w:type="gramEnd"/>
+    </w:p>
+    <w:p>
+      <w:r>
+        <w:rPr>
+          <w:rFonts w:ascii="MS Gothic" w:eastAsia="MS Gothic" w:hAnsi="MS Gothic" w:cs="MS Gothic" w:hint="eastAsia"/>
+        </w:rPr>
+        <w:t>├</w:t>
+      </w:r>
+      <w:r>
+        <w:rPr>
+          <w:rFonts w:ascii="Calibri" w:hAnsi="Calibri" w:cs="Calibri"/>
+        </w:rPr>
+        <w:t>──</w:t>
+      </w:r>
+      <w:r>
+        <w:t xml:space="preserve"> requirements.txt</w:t>
+      </w:r>
+    </w:p>
+    <w:p>
+      <w:r>
+        <w:rPr>
+          <w:rFonts w:ascii="MS Gothic" w:eastAsia="MS Gothic" w:hAnsi="MS Gothic" w:cs="MS Gothic" w:hint="eastAsia"/>
+        </w:rPr>
+        <w:t>├</w:t>
+      </w:r>
+      <w:r>
+        <w:rPr>
+          <w:rFonts w:ascii="Calibri" w:hAnsi="Calibri" w:cs="Calibri"/>
+        </w:rPr>
+        <w:t>──</w:t>
+      </w:r>
+      <w:r>
+        <w:t xml:space="preserve"> </w:t>
+      </w:r>
+      <w:proofErr w:type="spellStart"/>
+      <w:r>
+        <w:t>Dockerfile</w:t>
+      </w:r>
+      <w:proofErr w:type="spellEnd"/>
+    </w:p>
+    <w:p>
+      <w:r>
+        <w:rPr>
+          <w:rFonts w:ascii="MS Gothic" w:eastAsia="MS Gothic" w:hAnsi="MS Gothic" w:cs="MS Gothic" w:hint="eastAsia"/>
+        </w:rPr>
+        <w:t>├</w:t>
+      </w:r>
+      <w:r>
+        <w:rPr>
+          <w:rFonts w:ascii="Calibri" w:hAnsi="Calibri" w:cs="Calibri"/>
+        </w:rPr>
+        <w:t>──</w:t>
+      </w:r>
+      <w:r>
+        <w:t xml:space="preserve"> docker-</w:t>
+      </w:r>
+      <w:proofErr w:type="spellStart"/>
+      <w:r>
+        <w:t>compose.yml</w:t>
+      </w:r>
+      <w:proofErr w:type="spellEnd"/>
+    </w:p>
+    <w:p>
+      <w:r>
+        <w:t>└── README.md</w:t>
       </w:r>
     </w:p>
     <w:sectPr>

</xml_diff>

<commit_message>
added database tables and relationsips
</commit_message>
<xml_diff>
--- a/strucutre.docx
+++ b/strucutre.docx
@@ -3,13 +3,8 @@
 <w:document xmlns:wpc="http://schemas.microsoft.com/office/word/2010/wordprocessingCanvas" xmlns:cx="http://schemas.microsoft.com/office/drawing/2014/chartex" xmlns:cx1="http://schemas.microsoft.com/office/drawing/2015/9/8/chartex" xmlns:cx2="http://schemas.microsoft.com/office/drawing/2015/10/21/chartex" xmlns:cx3="http://schemas.microsoft.com/office/drawing/2016/5/9/chartex" xmlns:cx4="http://schemas.microsoft.com/office/drawing/2016/5/10/chartex" xmlns:cx5="http://schemas.microsoft.com/office/drawing/2016/5/11/chartex" xmlns:cx6="http://schemas.microsoft.com/office/drawing/2016/5/12/chartex" xmlns:cx7="http://schemas.microsoft.com/office/drawing/2016/5/13/chartex" xmlns:cx8="http://schemas.microsoft.com/office/drawing/2016/5/14/chartex" xmlns:mc="http://schemas.openxmlformats.org/markup-compatibility/2006" xmlns:aink="http://schemas.microsoft.com/office/drawing/2016/ink" xmlns:am3d="http://schemas.microsoft.com/office/drawing/2017/model3d" xmlns:o="urn:schemas-microsoft-com:office:office" xmlns:oel="http://schemas.microsoft.com/office/2019/extlst" xmlns:r="http://schemas.openxmlformats.org/officeDocument/2006/relationships" xmlns:m="http://schemas.openxmlformats.org/officeDocument/2006/math" xmlns:v="urn:schemas-microsoft-com:vml" xmlns:wp14="http://schemas.microsoft.com/office/word/2010/wordprocessingDrawing" xmlns:wp="http://schemas.openxmlformats.org/drawingml/2006/wordprocessingDrawing" xmlns:w10="urn:schemas-microsoft-com:office:word" xmlns:w="http://schemas.openxmlformats.org/wordprocessingml/2006/main" xmlns:w14="http://schemas.microsoft.com/office/word/2010/wordml" xmlns:w15="http://schemas.microsoft.com/office/word/2012/wordml" xmlns:w16cex="http://schemas.microsoft.com/office/word/2018/wordml/cex" xmlns:w16cid="http://schemas.microsoft.com/office/word/2016/wordml/cid" xmlns:w16="http://schemas.microsoft.com/office/word/2018/wordml" xmlns:w16du="http://schemas.microsoft.com/office/word/2023/wordml/word16du" xmlns:w16sdtdh="http://schemas.microsoft.com/office/word/2020/wordml/sdtdatahash" xmlns:w16sdtfl="http://schemas.microsoft.com/office/word/2024/wordml/sdtformatlock" xmlns:w16se="http://schemas.microsoft.com/office/word/2015/wordml/symex" xmlns:wpg="http://schemas.microsoft.com/office/word/2010/wordprocessingGroup" xmlns:wpi="http://schemas.microsoft.com/office/word/2010/wordprocessingInk" xmlns:wne="http://schemas.microsoft.com/office/word/2006/wordml" xmlns:wps="http://schemas.microsoft.com/office/word/2010/wordprocessingShape" mc:Ignorable="w14 w15 w16se w16cid w16 w16cex w16sdtdh w16sdtfl w16du wp14">
   <w:body>
     <w:p>
-      <w:proofErr w:type="spellStart"/>
-      <w:r>
-        <w:t>api</w:t>
-      </w:r>
-      <w:proofErr w:type="spellEnd"/>
-      <w:r>
-        <w:t>/</w:t>
+      <w:r>
+        <w:t>api/</w:t>
       </w:r>
     </w:p>
     <w:p>
@@ -31,100 +26,94 @@
         <w:t>──</w:t>
       </w:r>
       <w:r>
-        <w:t xml:space="preserve"> auth/                 # Login, Register, JWT, Refresh Token</w:t>
-      </w:r>
-    </w:p>
-    <w:p>
-      <w:r>
-        <w:rPr>
-          <w:rFonts w:ascii="MS Gothic" w:eastAsia="MS Gothic" w:hAnsi="MS Gothic" w:cs="MS Gothic" w:hint="eastAsia"/>
-        </w:rPr>
-        <w:t>├</w:t>
-      </w:r>
-      <w:r>
-        <w:rPr>
-          <w:rFonts w:ascii="Calibri" w:hAnsi="Calibri" w:cs="Calibri"/>
-        </w:rPr>
-        <w:t>──</w:t>
-      </w:r>
-      <w:r>
-        <w:t xml:space="preserve"> users/                # User profile, preferences</w:t>
-      </w:r>
-    </w:p>
-    <w:p>
-      <w:r>
-        <w:rPr>
-          <w:rFonts w:ascii="MS Gothic" w:eastAsia="MS Gothic" w:hAnsi="MS Gothic" w:cs="MS Gothic" w:hint="eastAsia"/>
-        </w:rPr>
-        <w:t>├</w:t>
-      </w:r>
-      <w:r>
-        <w:rPr>
-          <w:rFonts w:ascii="Calibri" w:hAnsi="Calibri" w:cs="Calibri"/>
-        </w:rPr>
-        <w:t>──</w:t>
-      </w:r>
-      <w:r>
-        <w:t xml:space="preserve"> technologies/         # Python, Docker, Redis, </w:t>
-      </w:r>
-      <w:proofErr w:type="spellStart"/>
-      <w:r>
-        <w:t>FastAPI</w:t>
-      </w:r>
-      <w:proofErr w:type="spellEnd"/>
-      <w:r>
-        <w:t>, AWS...</w:t>
-      </w:r>
-    </w:p>
-    <w:p>
-      <w:r>
-        <w:rPr>
-          <w:rFonts w:ascii="MS Gothic" w:eastAsia="MS Gothic" w:hAnsi="MS Gothic" w:cs="MS Gothic" w:hint="eastAsia"/>
-        </w:rPr>
-        <w:t>├</w:t>
-      </w:r>
-      <w:r>
-        <w:rPr>
-          <w:rFonts w:ascii="Calibri" w:hAnsi="Calibri" w:cs="Calibri"/>
-        </w:rPr>
-        <w:t>──</w:t>
-      </w:r>
-      <w:r>
-        <w:t xml:space="preserve"> courses/              # Course management</w:t>
-      </w:r>
-    </w:p>
-    <w:p>
-      <w:r>
-        <w:rPr>
-          <w:rFonts w:ascii="MS Gothic" w:eastAsia="MS Gothic" w:hAnsi="MS Gothic" w:cs="MS Gothic" w:hint="eastAsia"/>
-        </w:rPr>
-        <w:t>├</w:t>
-      </w:r>
-      <w:r>
-        <w:rPr>
-          <w:rFonts w:ascii="Calibri" w:hAnsi="Calibri" w:cs="Calibri"/>
-        </w:rPr>
-        <w:t>──</w:t>
-      </w:r>
-      <w:r>
-        <w:t xml:space="preserve"> modules/              # Modules inside a course</w:t>
-      </w:r>
-    </w:p>
-    <w:p>
-      <w:r>
-        <w:rPr>
-          <w:rFonts w:ascii="MS Gothic" w:eastAsia="MS Gothic" w:hAnsi="MS Gothic" w:cs="MS Gothic" w:hint="eastAsia"/>
-        </w:rPr>
-        <w:t>├</w:t>
-      </w:r>
-      <w:r>
-        <w:rPr>
-          <w:rFonts w:ascii="Calibri" w:hAnsi="Calibri" w:cs="Calibri"/>
-        </w:rPr>
-        <w:t>──</w:t>
-      </w:r>
-      <w:r>
-        <w:t xml:space="preserve"> lessons/              # Individual lessons</w:t>
+        <w:t xml:space="preserve"> </w:t>
+      </w:r>
+      <w:r>
+        <w:rPr>
+          <w:highlight w:val="yellow"/>
+        </w:rPr>
+        <w:t>auth/</w:t>
+      </w:r>
+      <w:r>
+        <w:t xml:space="preserve">                 # Login, Register, JWT, Refresh Token</w:t>
+      </w:r>
+    </w:p>
+    <w:p>
+      <w:r>
+        <w:rPr>
+          <w:rFonts w:ascii="MS Gothic" w:eastAsia="MS Gothic" w:hAnsi="MS Gothic" w:cs="MS Gothic" w:hint="eastAsia"/>
+        </w:rPr>
+        <w:t>├</w:t>
+      </w:r>
+      <w:r>
+        <w:rPr>
+          <w:rFonts w:ascii="Calibri" w:hAnsi="Calibri" w:cs="Calibri"/>
+        </w:rPr>
+        <w:t>──</w:t>
+      </w:r>
+      <w:r>
+        <w:t xml:space="preserve"> </w:t>
+      </w:r>
+      <w:r>
+        <w:rPr>
+          <w:highlight w:val="yellow"/>
+        </w:rPr>
+        <w:t>users/</w:t>
+      </w:r>
+      <w:r>
+        <w:t xml:space="preserve">                # User profile, preferences</w:t>
+      </w:r>
+    </w:p>
+    <w:p>
+      <w:r>
+        <w:rPr>
+          <w:rFonts w:ascii="MS Gothic" w:eastAsia="MS Gothic" w:hAnsi="MS Gothic" w:cs="MS Gothic" w:hint="eastAsia"/>
+        </w:rPr>
+        <w:t>├</w:t>
+      </w:r>
+      <w:r>
+        <w:rPr>
+          <w:rFonts w:ascii="Calibri" w:hAnsi="Calibri" w:cs="Calibri"/>
+        </w:rPr>
+        <w:t>──</w:t>
+      </w:r>
+      <w:r>
+        <w:t xml:space="preserve"> </w:t>
+      </w:r>
+      <w:r>
+        <w:rPr>
+          <w:highlight w:val="yellow"/>
+        </w:rPr>
+        <w:t>technologies</w:t>
+      </w:r>
+      <w:r>
+        <w:t>/         # Python, Docker, Redis, FastAPI, AWS...</w:t>
+      </w:r>
+    </w:p>
+    <w:p>
+      <w:r>
+        <w:rPr>
+          <w:rFonts w:ascii="MS Gothic" w:eastAsia="MS Gothic" w:hAnsi="MS Gothic" w:cs="MS Gothic" w:hint="eastAsia"/>
+        </w:rPr>
+        <w:t>├</w:t>
+      </w:r>
+      <w:r>
+        <w:rPr>
+          <w:rFonts w:ascii="Calibri" w:hAnsi="Calibri" w:cs="Calibri"/>
+        </w:rPr>
+        <w:t>──</w:t>
+      </w:r>
+      <w:r>
+        <w:t xml:space="preserve"> </w:t>
+      </w:r>
+      <w:r>
+        <w:rPr>
+          <w:highlight w:val="yellow"/>
+        </w:rPr>
+        <w:t>courses</w:t>
+      </w:r>
+      <w:r>
+        <w:t>/              # Course management</w:t>
       </w:r>
     </w:p>
     <w:p>
@@ -158,74 +147,6 @@
         <w:t>──</w:t>
       </w:r>
       <w:r>
-        <w:t xml:space="preserve"> coding/               # Coding exercises</w:t>
-      </w:r>
-    </w:p>
-    <w:p>
-      <w:r>
-        <w:rPr>
-          <w:rFonts w:ascii="MS Gothic" w:eastAsia="MS Gothic" w:hAnsi="MS Gothic" w:cs="MS Gothic" w:hint="eastAsia"/>
-        </w:rPr>
-        <w:t>├</w:t>
-      </w:r>
-      <w:r>
-        <w:rPr>
-          <w:rFonts w:ascii="Calibri" w:hAnsi="Calibri" w:cs="Calibri"/>
-        </w:rPr>
-        <w:t>──</w:t>
-      </w:r>
-      <w:r>
-        <w:t xml:space="preserve"> submissions/          # Code/quiz submissions</w:t>
-      </w:r>
-    </w:p>
-    <w:p>
-      <w:r>
-        <w:rPr>
-          <w:rFonts w:ascii="MS Gothic" w:eastAsia="MS Gothic" w:hAnsi="MS Gothic" w:cs="MS Gothic" w:hint="eastAsia"/>
-        </w:rPr>
-        <w:t>├</w:t>
-      </w:r>
-      <w:r>
-        <w:rPr>
-          <w:rFonts w:ascii="Calibri" w:hAnsi="Calibri" w:cs="Calibri"/>
-        </w:rPr>
-        <w:t>──</w:t>
-      </w:r>
-      <w:r>
-        <w:t xml:space="preserve"> progress/             # Learning progress tracking</w:t>
-      </w:r>
-    </w:p>
-    <w:p>
-      <w:r>
-        <w:rPr>
-          <w:rFonts w:ascii="MS Gothic" w:eastAsia="MS Gothic" w:hAnsi="MS Gothic" w:cs="MS Gothic" w:hint="eastAsia"/>
-        </w:rPr>
-        <w:t>├</w:t>
-      </w:r>
-      <w:r>
-        <w:rPr>
-          <w:rFonts w:ascii="Calibri" w:hAnsi="Calibri" w:cs="Calibri"/>
-        </w:rPr>
-        <w:t>──</w:t>
-      </w:r>
-      <w:r>
-        <w:t xml:space="preserve"> certificates/         # Certificate generation</w:t>
-      </w:r>
-    </w:p>
-    <w:p>
-      <w:r>
-        <w:rPr>
-          <w:rFonts w:ascii="MS Gothic" w:eastAsia="MS Gothic" w:hAnsi="MS Gothic" w:cs="MS Gothic" w:hint="eastAsia"/>
-        </w:rPr>
-        <w:t>├</w:t>
-      </w:r>
-      <w:r>
-        <w:rPr>
-          <w:rFonts w:ascii="Calibri" w:hAnsi="Calibri" w:cs="Calibri"/>
-        </w:rPr>
-        <w:t>──</w:t>
-      </w:r>
-      <w:r>
         <w:t xml:space="preserve"> bookmarks/            # Saved courses/lessons</w:t>
       </w:r>
     </w:p>
@@ -250,68 +171,87 @@
       <w:r>
         <w:rPr>
           <w:rFonts w:ascii="MS Gothic" w:eastAsia="MS Gothic" w:hAnsi="MS Gothic" w:cs="MS Gothic" w:hint="eastAsia"/>
-        </w:rPr>
-        <w:t>├</w:t>
-      </w:r>
-      <w:r>
-        <w:rPr>
-          <w:rFonts w:ascii="Calibri" w:hAnsi="Calibri" w:cs="Calibri"/>
-        </w:rPr>
-        <w:t>──</w:t>
-      </w:r>
-      <w:r>
-        <w:t xml:space="preserve"> recommendations/      # Recommended courses</w:t>
-      </w:r>
-    </w:p>
-    <w:p>
-      <w:r>
-        <w:rPr>
-          <w:rFonts w:ascii="MS Gothic" w:eastAsia="MS Gothic" w:hAnsi="MS Gothic" w:cs="MS Gothic" w:hint="eastAsia"/>
-        </w:rPr>
-        <w:t>├</w:t>
-      </w:r>
-      <w:r>
-        <w:rPr>
-          <w:rFonts w:ascii="Calibri" w:hAnsi="Calibri" w:cs="Calibri"/>
-        </w:rPr>
-        <w:t>──</w:t>
-      </w:r>
-      <w:r>
-        <w:t xml:space="preserve"> discussions/          # Q&amp;A / Discussion forum</w:t>
-      </w:r>
-    </w:p>
-    <w:p>
-      <w:r>
-        <w:rPr>
-          <w:rFonts w:ascii="MS Gothic" w:eastAsia="MS Gothic" w:hAnsi="MS Gothic" w:cs="MS Gothic" w:hint="eastAsia"/>
-        </w:rPr>
-        <w:t>├</w:t>
-      </w:r>
-      <w:r>
-        <w:rPr>
-          <w:rFonts w:ascii="Calibri" w:hAnsi="Calibri" w:cs="Calibri"/>
-        </w:rPr>
-        <w:t>──</w:t>
-      </w:r>
-      <w:r>
-        <w:t xml:space="preserve"> notifications/        # In-app notifications</w:t>
-      </w:r>
-    </w:p>
-    <w:p>
-      <w:r>
-        <w:rPr>
-          <w:rFonts w:ascii="MS Gothic" w:eastAsia="MS Gothic" w:hAnsi="MS Gothic" w:cs="MS Gothic" w:hint="eastAsia"/>
-        </w:rPr>
-        <w:t>├</w:t>
-      </w:r>
-      <w:r>
-        <w:rPr>
-          <w:rFonts w:ascii="Calibri" w:hAnsi="Calibri" w:cs="Calibri"/>
-        </w:rPr>
-        <w:t>──</w:t>
-      </w:r>
-      <w:r>
-        <w:t xml:space="preserve"> uploads/              # Upload videos, PDFs, images</w:t>
+          <w:highlight w:val="yellow"/>
+        </w:rPr>
+        <w:t>├</w:t>
+      </w:r>
+      <w:r>
+        <w:rPr>
+          <w:rFonts w:ascii="Calibri" w:hAnsi="Calibri" w:cs="Calibri"/>
+          <w:highlight w:val="yellow"/>
+        </w:rPr>
+        <w:t>──</w:t>
+      </w:r>
+      <w:r>
+        <w:rPr>
+          <w:highlight w:val="yellow"/>
+        </w:rPr>
+        <w:t xml:space="preserve"> </w:t>
+      </w:r>
+      <w:r>
+        <w:rPr>
+          <w:highlight w:val="yellow"/>
+        </w:rPr>
+        <w:t>recommendations</w:t>
+      </w:r>
+      <w:r>
+        <w:t>/      # Recommended courses</w:t>
+      </w:r>
+    </w:p>
+    <w:p>
+      <w:r>
+        <w:rPr>
+          <w:rFonts w:ascii="MS Gothic" w:eastAsia="MS Gothic" w:hAnsi="MS Gothic" w:cs="MS Gothic" w:hint="eastAsia"/>
+          <w:highlight w:val="yellow"/>
+        </w:rPr>
+        <w:t>├</w:t>
+      </w:r>
+      <w:r>
+        <w:rPr>
+          <w:rFonts w:ascii="Calibri" w:hAnsi="Calibri" w:cs="Calibri"/>
+          <w:highlight w:val="yellow"/>
+        </w:rPr>
+        <w:t>──</w:t>
+      </w:r>
+      <w:r>
+        <w:rPr>
+          <w:highlight w:val="yellow"/>
+        </w:rPr>
+        <w:t xml:space="preserve"> </w:t>
+      </w:r>
+      <w:r>
+        <w:t>discussions</w:t>
+      </w:r>
+      <w:r>
+        <w:rPr>
+          <w:highlight w:val="yellow"/>
+        </w:rPr>
+        <w:t>/          # Q&amp;A / Discussion forum</w:t>
+      </w:r>
+    </w:p>
+    <w:p>
+      <w:r>
+        <w:rPr>
+          <w:rFonts w:ascii="MS Gothic" w:eastAsia="MS Gothic" w:hAnsi="MS Gothic" w:cs="MS Gothic" w:hint="eastAsia"/>
+          <w:highlight w:val="yellow"/>
+        </w:rPr>
+        <w:t>├</w:t>
+      </w:r>
+      <w:r>
+        <w:rPr>
+          <w:rFonts w:ascii="Calibri" w:hAnsi="Calibri" w:cs="Calibri"/>
+          <w:highlight w:val="yellow"/>
+        </w:rPr>
+        <w:t>──</w:t>
+      </w:r>
+      <w:r>
+        <w:rPr>
+          <w:highlight w:val="yellow"/>
+        </w:rPr>
+        <w:t xml:space="preserve"> uploads</w:t>
+      </w:r>
+      <w:r>
+        <w:t>/              # Upload videos, PDFs, images</w:t>
       </w:r>
     </w:p>
     <w:p>
@@ -334,40 +274,36 @@
     <w:p>
       <w:r>
         <w:t>└── analytics/            # Dashboard &amp; learning statistics</w:t>
+      </w:r>
+    </w:p>
+    <w:p>
+      <w:r>
+        <w:t>enrollment</w:t>
       </w:r>
     </w:p>
     <w:p/>
     <w:p/>
+    <w:p>
+      <w:r>
+        <w:t>developer-learning-hub/</w:t>
+      </w:r>
+    </w:p>
     <w:p/>
     <w:p>
       <w:r>
-        <w:t>developer-learning-hub/</w:t>
-      </w:r>
-    </w:p>
-    <w:p/>
-    <w:p>
-      <w:r>
-        <w:rPr>
-          <w:rFonts w:ascii="MS Gothic" w:eastAsia="MS Gothic" w:hAnsi="MS Gothic" w:cs="MS Gothic" w:hint="eastAsia"/>
-        </w:rPr>
-        <w:t>├</w:t>
-      </w:r>
-      <w:r>
-        <w:rPr>
-          <w:rFonts w:ascii="Calibri" w:hAnsi="Calibri" w:cs="Calibri"/>
-        </w:rPr>
-        <w:t>──</w:t>
-      </w:r>
-      <w:r>
-        <w:t xml:space="preserve"> </w:t>
-      </w:r>
-      <w:proofErr w:type="spellStart"/>
-      <w:r>
-        <w:t>src</w:t>
-      </w:r>
-      <w:proofErr w:type="spellEnd"/>
-      <w:r>
-        <w:t>/</w:t>
+        <w:rPr>
+          <w:rFonts w:ascii="MS Gothic" w:eastAsia="MS Gothic" w:hAnsi="MS Gothic" w:cs="MS Gothic" w:hint="eastAsia"/>
+        </w:rPr>
+        <w:t>├</w:t>
+      </w:r>
+      <w:r>
+        <w:rPr>
+          <w:rFonts w:ascii="Calibri" w:hAnsi="Calibri" w:cs="Calibri"/>
+        </w:rPr>
+        <w:t>──</w:t>
+      </w:r>
+      <w:r>
+        <w:t xml:space="preserve"> src/</w:t>
       </w:r>
     </w:p>
     <w:p>
@@ -387,7 +323,137 @@
     </w:p>
     <w:p>
       <w:r>
+        <w:t xml:space="preserve">│   </w:t>
+      </w:r>
+      <w:r>
+        <w:rPr>
+          <w:rFonts w:ascii="MS Gothic" w:eastAsia="MS Gothic" w:hAnsi="MS Gothic" w:cs="MS Gothic" w:hint="eastAsia"/>
+        </w:rPr>
+        <w:t>├</w:t>
+      </w:r>
+      <w:r>
+        <w:rPr>
+          <w:rFonts w:ascii="Calibri" w:hAnsi="Calibri" w:cs="Calibri"/>
+        </w:rPr>
+        <w:t>──</w:t>
+      </w:r>
+      <w:r>
+        <w:t xml:space="preserve"> core/</w:t>
+      </w:r>
+    </w:p>
+    <w:p>
+      <w:r>
+        <w:t xml:space="preserve">│   │   </w:t>
+      </w:r>
+      <w:r>
+        <w:rPr>
+          <w:rFonts w:ascii="MS Gothic" w:eastAsia="MS Gothic" w:hAnsi="MS Gothic" w:cs="MS Gothic" w:hint="eastAsia"/>
+        </w:rPr>
+        <w:t>├</w:t>
+      </w:r>
+      <w:r>
+        <w:rPr>
+          <w:rFonts w:ascii="Calibri" w:hAnsi="Calibri" w:cs="Calibri"/>
+        </w:rPr>
+        <w:t>──</w:t>
+      </w:r>
+      <w:r>
+        <w:t xml:space="preserve"> config.py</w:t>
+      </w:r>
+    </w:p>
+    <w:p>
+      <w:r>
+        <w:t xml:space="preserve">│   │   </w:t>
+      </w:r>
+      <w:r>
+        <w:rPr>
+          <w:rFonts w:ascii="MS Gothic" w:eastAsia="MS Gothic" w:hAnsi="MS Gothic" w:cs="MS Gothic" w:hint="eastAsia"/>
+        </w:rPr>
+        <w:t>├</w:t>
+      </w:r>
+      <w:r>
+        <w:rPr>
+          <w:rFonts w:ascii="Calibri" w:hAnsi="Calibri" w:cs="Calibri"/>
+        </w:rPr>
+        <w:t>──</w:t>
+      </w:r>
+      <w:r>
+        <w:t xml:space="preserve"> security.py</w:t>
+      </w:r>
+    </w:p>
+    <w:p>
+      <w:r>
+        <w:t xml:space="preserve">│   │   </w:t>
+      </w:r>
+      <w:r>
+        <w:rPr>
+          <w:rFonts w:ascii="MS Gothic" w:eastAsia="MS Gothic" w:hAnsi="MS Gothic" w:cs="MS Gothic" w:hint="eastAsia"/>
+        </w:rPr>
+        <w:t>├</w:t>
+      </w:r>
+      <w:r>
+        <w:rPr>
+          <w:rFonts w:ascii="Calibri" w:hAnsi="Calibri" w:cs="Calibri"/>
+        </w:rPr>
+        <w:t>──</w:t>
+      </w:r>
+      <w:r>
+        <w:t xml:space="preserve"> jwt.py</w:t>
+      </w:r>
+    </w:p>
+    <w:p>
+      <w:r>
+        <w:t xml:space="preserve">│   │   </w:t>
+      </w:r>
+      <w:r>
+        <w:rPr>
+          <w:rFonts w:ascii="MS Gothic" w:eastAsia="MS Gothic" w:hAnsi="MS Gothic" w:cs="MS Gothic" w:hint="eastAsia"/>
+        </w:rPr>
+        <w:t>├</w:t>
+      </w:r>
+      <w:r>
+        <w:rPr>
+          <w:rFonts w:ascii="Calibri" w:hAnsi="Calibri" w:cs="Calibri"/>
+        </w:rPr>
+        <w:t>──</w:t>
+      </w:r>
+      <w:r>
+        <w:t xml:space="preserve"> logging.py</w:t>
+      </w:r>
+    </w:p>
+    <w:p>
+      <w:r>
+        <w:t xml:space="preserve">│   │   </w:t>
+      </w:r>
+      <w:r>
+        <w:rPr>
+          <w:rFonts w:ascii="MS Gothic" w:eastAsia="MS Gothic" w:hAnsi="MS Gothic" w:cs="MS Gothic" w:hint="eastAsia"/>
+        </w:rPr>
+        <w:t>├</w:t>
+      </w:r>
+      <w:r>
+        <w:rPr>
+          <w:rFonts w:ascii="Calibri" w:hAnsi="Calibri" w:cs="Calibri"/>
+        </w:rPr>
+        <w:t>──</w:t>
+      </w:r>
+      <w:r>
+        <w:t xml:space="preserve"> exceptions.py</w:t>
+      </w:r>
+    </w:p>
+    <w:p>
+      <w:r>
+        <w:t>│   │   └── settings.py</w:t>
+      </w:r>
+    </w:p>
+    <w:p>
+      <w:r>
         <w:lastRenderedPageBreak/>
+        <w:t>│   │</w:t>
+      </w:r>
+    </w:p>
+    <w:p>
+      <w:r>
         <w:t xml:space="preserve">│   </w:t>
       </w:r>
       <w:r>
@@ -403,7 +469,7 @@
         <w:t>──</w:t>
       </w:r>
       <w:r>
-        <w:t xml:space="preserve"> core/</w:t>
+        <w:t xml:space="preserve"> database/</w:t>
       </w:r>
     </w:p>
     <w:p>
@@ -423,7 +489,7 @@
         <w:t>──</w:t>
       </w:r>
       <w:r>
-        <w:t xml:space="preserve"> config.py</w:t>
+        <w:t xml:space="preserve"> base.py</w:t>
       </w:r>
     </w:p>
     <w:p>
@@ -443,7 +509,37 @@
         <w:t>──</w:t>
       </w:r>
       <w:r>
-        <w:t xml:space="preserve"> security.py</w:t>
+        <w:t xml:space="preserve"> session.py</w:t>
+      </w:r>
+    </w:p>
+    <w:p>
+      <w:r>
+        <w:t>│   │   └── database.py</w:t>
+      </w:r>
+    </w:p>
+    <w:p>
+      <w:r>
+        <w:t>│   │</w:t>
+      </w:r>
+    </w:p>
+    <w:p>
+      <w:r>
+        <w:t xml:space="preserve">│   </w:t>
+      </w:r>
+      <w:r>
+        <w:rPr>
+          <w:rFonts w:ascii="MS Gothic" w:eastAsia="MS Gothic" w:hAnsi="MS Gothic" w:cs="MS Gothic" w:hint="eastAsia"/>
+        </w:rPr>
+        <w:t>├</w:t>
+      </w:r>
+      <w:r>
+        <w:rPr>
+          <w:rFonts w:ascii="Calibri" w:hAnsi="Calibri" w:cs="Calibri"/>
+        </w:rPr>
+        <w:t>──</w:t>
+      </w:r>
+      <w:r>
+        <w:t xml:space="preserve"> redis/</w:t>
       </w:r>
     </w:p>
     <w:p>
@@ -463,7 +559,7 @@
         <w:t>──</w:t>
       </w:r>
       <w:r>
-        <w:t xml:space="preserve"> jwt.py</w:t>
+        <w:t xml:space="preserve"> client.py</w:t>
       </w:r>
     </w:p>
     <w:p>
@@ -483,6 +579,96 @@
         <w:t>──</w:t>
       </w:r>
       <w:r>
+        <w:t xml:space="preserve"> cache.py</w:t>
+      </w:r>
+    </w:p>
+    <w:p>
+      <w:r>
+        <w:t xml:space="preserve">│   │   </w:t>
+      </w:r>
+      <w:r>
+        <w:rPr>
+          <w:rFonts w:ascii="MS Gothic" w:eastAsia="MS Gothic" w:hAnsi="MS Gothic" w:cs="MS Gothic" w:hint="eastAsia"/>
+        </w:rPr>
+        <w:t>├</w:t>
+      </w:r>
+      <w:r>
+        <w:rPr>
+          <w:rFonts w:ascii="Calibri" w:hAnsi="Calibri" w:cs="Calibri"/>
+        </w:rPr>
+        <w:t>──</w:t>
+      </w:r>
+      <w:r>
+        <w:t xml:space="preserve"> blacklist.py</w:t>
+      </w:r>
+    </w:p>
+    <w:p>
+      <w:r>
+        <w:t>│   │   └── pubsub.py</w:t>
+      </w:r>
+    </w:p>
+    <w:p>
+      <w:r>
+        <w:t>│   │</w:t>
+      </w:r>
+    </w:p>
+    <w:p>
+      <w:r>
+        <w:t xml:space="preserve">│   </w:t>
+      </w:r>
+      <w:r>
+        <w:rPr>
+          <w:rFonts w:ascii="MS Gothic" w:eastAsia="MS Gothic" w:hAnsi="MS Gothic" w:cs="MS Gothic" w:hint="eastAsia"/>
+        </w:rPr>
+        <w:t>├</w:t>
+      </w:r>
+      <w:r>
+        <w:rPr>
+          <w:rFonts w:ascii="Calibri" w:hAnsi="Calibri" w:cs="Calibri"/>
+        </w:rPr>
+        <w:t>──</w:t>
+      </w:r>
+      <w:r>
+        <w:t xml:space="preserve"> middleware/</w:t>
+      </w:r>
+    </w:p>
+    <w:p>
+      <w:r>
+        <w:t xml:space="preserve">│   │   </w:t>
+      </w:r>
+      <w:r>
+        <w:rPr>
+          <w:rFonts w:ascii="MS Gothic" w:eastAsia="MS Gothic" w:hAnsi="MS Gothic" w:cs="MS Gothic" w:hint="eastAsia"/>
+        </w:rPr>
+        <w:t>├</w:t>
+      </w:r>
+      <w:r>
+        <w:rPr>
+          <w:rFonts w:ascii="Calibri" w:hAnsi="Calibri" w:cs="Calibri"/>
+        </w:rPr>
+        <w:t>──</w:t>
+      </w:r>
+      <w:r>
+        <w:t xml:space="preserve"> auth.py</w:t>
+      </w:r>
+    </w:p>
+    <w:p>
+      <w:r>
+        <w:t xml:space="preserve">│   │   </w:t>
+      </w:r>
+      <w:r>
+        <w:rPr>
+          <w:rFonts w:ascii="MS Gothic" w:eastAsia="MS Gothic" w:hAnsi="MS Gothic" w:cs="MS Gothic" w:hint="eastAsia"/>
+        </w:rPr>
+        <w:t>├</w:t>
+      </w:r>
+      <w:r>
+        <w:rPr>
+          <w:rFonts w:ascii="Calibri" w:hAnsi="Calibri" w:cs="Calibri"/>
+        </w:rPr>
+        <w:t>──</w:t>
+      </w:r>
+      <w:r>
         <w:t xml:space="preserve"> logging.py</w:t>
       </w:r>
     </w:p>
@@ -503,12 +689,12 @@
         <w:t>──</w:t>
       </w:r>
       <w:r>
-        <w:t xml:space="preserve"> exceptions.py</w:t>
-      </w:r>
-    </w:p>
-    <w:p>
-      <w:r>
-        <w:t>│   │   └── settings.py</w:t>
+        <w:t xml:space="preserve"> rate_limit.py</w:t>
+      </w:r>
+    </w:p>
+    <w:p>
+      <w:r>
+        <w:t>│   │   └── cors.py</w:t>
       </w:r>
     </w:p>
     <w:p>
@@ -533,7 +719,7 @@
         <w:t>──</w:t>
       </w:r>
       <w:r>
-        <w:t xml:space="preserve"> database/</w:t>
+        <w:t xml:space="preserve"> common/</w:t>
       </w:r>
     </w:p>
     <w:p>
@@ -553,7 +739,7 @@
         <w:t>──</w:t>
       </w:r>
       <w:r>
-        <w:t xml:space="preserve"> base.py</w:t>
+        <w:t xml:space="preserve"> dependencies.py</w:t>
       </w:r>
     </w:p>
     <w:p>
@@ -573,12 +759,52 @@
         <w:t>──</w:t>
       </w:r>
       <w:r>
-        <w:t xml:space="preserve"> session.py</w:t>
-      </w:r>
-    </w:p>
-    <w:p>
-      <w:r>
-        <w:t>│   │   └── database.py</w:t>
+        <w:t xml:space="preserve"> pagination.py</w:t>
+      </w:r>
+    </w:p>
+    <w:p>
+      <w:r>
+        <w:t xml:space="preserve">│   │   </w:t>
+      </w:r>
+      <w:r>
+        <w:rPr>
+          <w:rFonts w:ascii="MS Gothic" w:eastAsia="MS Gothic" w:hAnsi="MS Gothic" w:cs="MS Gothic" w:hint="eastAsia"/>
+        </w:rPr>
+        <w:t>├</w:t>
+      </w:r>
+      <w:r>
+        <w:rPr>
+          <w:rFonts w:ascii="Calibri" w:hAnsi="Calibri" w:cs="Calibri"/>
+        </w:rPr>
+        <w:t>──</w:t>
+      </w:r>
+      <w:r>
+        <w:t xml:space="preserve"> permissions.py</w:t>
+      </w:r>
+    </w:p>
+    <w:p>
+      <w:r>
+        <w:t xml:space="preserve">│   │   </w:t>
+      </w:r>
+      <w:r>
+        <w:rPr>
+          <w:rFonts w:ascii="MS Gothic" w:eastAsia="MS Gothic" w:hAnsi="MS Gothic" w:cs="MS Gothic" w:hint="eastAsia"/>
+        </w:rPr>
+        <w:t>├</w:t>
+      </w:r>
+      <w:r>
+        <w:rPr>
+          <w:rFonts w:ascii="Calibri" w:hAnsi="Calibri" w:cs="Calibri"/>
+        </w:rPr>
+        <w:t>──</w:t>
+      </w:r>
+      <w:r>
+        <w:t xml:space="preserve"> responses.py</w:t>
+      </w:r>
+    </w:p>
+    <w:p>
+      <w:r>
+        <w:t>│   │   └── constants.py</w:t>
       </w:r>
     </w:p>
     <w:p>
@@ -603,15 +829,7 @@
         <w:t>──</w:t>
       </w:r>
       <w:r>
-        <w:t xml:space="preserve"> </w:t>
-      </w:r>
-      <w:proofErr w:type="spellStart"/>
-      <w:r>
-        <w:t>redis</w:t>
-      </w:r>
-      <w:proofErr w:type="spellEnd"/>
-      <w:r>
-        <w:t>/</w:t>
+        <w:t xml:space="preserve"> utils/</w:t>
       </w:r>
     </w:p>
     <w:p>
@@ -631,7 +849,7 @@
         <w:t>──</w:t>
       </w:r>
       <w:r>
-        <w:t xml:space="preserve"> client.py</w:t>
+        <w:t xml:space="preserve"> helpers.py</w:t>
       </w:r>
     </w:p>
     <w:p>
@@ -651,7 +869,7 @@
         <w:t>──</w:t>
       </w:r>
       <w:r>
-        <w:t xml:space="preserve"> cache.py</w:t>
+        <w:t xml:space="preserve"> validators.py</w:t>
       </w:r>
     </w:p>
     <w:p>
@@ -671,16 +889,17 @@
         <w:t>──</w:t>
       </w:r>
       <w:r>
-        <w:t xml:space="preserve"> blacklist.py</w:t>
-      </w:r>
-    </w:p>
-    <w:p>
-      <w:r>
-        <w:t>│   │   └── pubsub.py</w:t>
-      </w:r>
-    </w:p>
-    <w:p>
-      <w:r>
+        <w:t xml:space="preserve"> file_upload.py</w:t>
+      </w:r>
+    </w:p>
+    <w:p>
+      <w:r>
+        <w:t>│   │   └── email.py</w:t>
+      </w:r>
+    </w:p>
+    <w:p>
+      <w:r>
+        <w:lastRenderedPageBreak/>
         <w:t>│   │</w:t>
       </w:r>
     </w:p>
@@ -701,72 +920,7 @@
         <w:t>──</w:t>
       </w:r>
       <w:r>
-        <w:t xml:space="preserve"> middleware/</w:t>
-      </w:r>
-    </w:p>
-    <w:p>
-      <w:r>
-        <w:t xml:space="preserve">│   │   </w:t>
-      </w:r>
-      <w:r>
-        <w:rPr>
-          <w:rFonts w:ascii="MS Gothic" w:eastAsia="MS Gothic" w:hAnsi="MS Gothic" w:cs="MS Gothic" w:hint="eastAsia"/>
-        </w:rPr>
-        <w:t>├</w:t>
-      </w:r>
-      <w:r>
-        <w:rPr>
-          <w:rFonts w:ascii="Calibri" w:hAnsi="Calibri" w:cs="Calibri"/>
-        </w:rPr>
-        <w:t>──</w:t>
-      </w:r>
-      <w:r>
-        <w:t xml:space="preserve"> auth.py</w:t>
-      </w:r>
-    </w:p>
-    <w:p>
-      <w:r>
-        <w:t xml:space="preserve">│   │   </w:t>
-      </w:r>
-      <w:r>
-        <w:rPr>
-          <w:rFonts w:ascii="MS Gothic" w:eastAsia="MS Gothic" w:hAnsi="MS Gothic" w:cs="MS Gothic" w:hint="eastAsia"/>
-        </w:rPr>
-        <w:t>├</w:t>
-      </w:r>
-      <w:r>
-        <w:rPr>
-          <w:rFonts w:ascii="Calibri" w:hAnsi="Calibri" w:cs="Calibri"/>
-        </w:rPr>
-        <w:t>──</w:t>
-      </w:r>
-      <w:r>
-        <w:t xml:space="preserve"> logging.py</w:t>
-      </w:r>
-    </w:p>
-    <w:p>
-      <w:r>
-        <w:t xml:space="preserve">│   │   </w:t>
-      </w:r>
-      <w:r>
-        <w:rPr>
-          <w:rFonts w:ascii="MS Gothic" w:eastAsia="MS Gothic" w:hAnsi="MS Gothic" w:cs="MS Gothic" w:hint="eastAsia"/>
-        </w:rPr>
-        <w:t>├</w:t>
-      </w:r>
-      <w:r>
-        <w:rPr>
-          <w:rFonts w:ascii="Calibri" w:hAnsi="Calibri" w:cs="Calibri"/>
-        </w:rPr>
-        <w:t>──</w:t>
-      </w:r>
-      <w:r>
-        <w:t xml:space="preserve"> rate_limit.py</w:t>
-      </w:r>
-    </w:p>
-    <w:p>
-      <w:r>
-        <w:t>│   │   └── cors.py</w:t>
+        <w:t xml:space="preserve"> tests/</w:t>
       </w:r>
     </w:p>
     <w:p>
@@ -776,232 +930,6 @@
     </w:p>
     <w:p>
       <w:r>
-        <w:t xml:space="preserve">│   </w:t>
-      </w:r>
-      <w:r>
-        <w:rPr>
-          <w:rFonts w:ascii="MS Gothic" w:eastAsia="MS Gothic" w:hAnsi="MS Gothic" w:cs="MS Gothic" w:hint="eastAsia"/>
-        </w:rPr>
-        <w:t>├</w:t>
-      </w:r>
-      <w:r>
-        <w:rPr>
-          <w:rFonts w:ascii="Calibri" w:hAnsi="Calibri" w:cs="Calibri"/>
-        </w:rPr>
-        <w:t>──</w:t>
-      </w:r>
-      <w:r>
-        <w:t xml:space="preserve"> common/</w:t>
-      </w:r>
-    </w:p>
-    <w:p>
-      <w:r>
-        <w:t xml:space="preserve">│   │   </w:t>
-      </w:r>
-      <w:r>
-        <w:rPr>
-          <w:rFonts w:ascii="MS Gothic" w:eastAsia="MS Gothic" w:hAnsi="MS Gothic" w:cs="MS Gothic" w:hint="eastAsia"/>
-        </w:rPr>
-        <w:t>├</w:t>
-      </w:r>
-      <w:r>
-        <w:rPr>
-          <w:rFonts w:ascii="Calibri" w:hAnsi="Calibri" w:cs="Calibri"/>
-        </w:rPr>
-        <w:t>──</w:t>
-      </w:r>
-      <w:r>
-        <w:t xml:space="preserve"> dependencies.py</w:t>
-      </w:r>
-    </w:p>
-    <w:p>
-      <w:r>
-        <w:t xml:space="preserve">│   │   </w:t>
-      </w:r>
-      <w:r>
-        <w:rPr>
-          <w:rFonts w:ascii="MS Gothic" w:eastAsia="MS Gothic" w:hAnsi="MS Gothic" w:cs="MS Gothic" w:hint="eastAsia"/>
-        </w:rPr>
-        <w:t>├</w:t>
-      </w:r>
-      <w:r>
-        <w:rPr>
-          <w:rFonts w:ascii="Calibri" w:hAnsi="Calibri" w:cs="Calibri"/>
-        </w:rPr>
-        <w:t>──</w:t>
-      </w:r>
-      <w:r>
-        <w:t xml:space="preserve"> pagination.py</w:t>
-      </w:r>
-    </w:p>
-    <w:p>
-      <w:r>
-        <w:t xml:space="preserve">│   │   </w:t>
-      </w:r>
-      <w:r>
-        <w:rPr>
-          <w:rFonts w:ascii="MS Gothic" w:eastAsia="MS Gothic" w:hAnsi="MS Gothic" w:cs="MS Gothic" w:hint="eastAsia"/>
-        </w:rPr>
-        <w:t>├</w:t>
-      </w:r>
-      <w:r>
-        <w:rPr>
-          <w:rFonts w:ascii="Calibri" w:hAnsi="Calibri" w:cs="Calibri"/>
-        </w:rPr>
-        <w:t>──</w:t>
-      </w:r>
-      <w:r>
-        <w:t xml:space="preserve"> permissions.py</w:t>
-      </w:r>
-    </w:p>
-    <w:p>
-      <w:r>
-        <w:t xml:space="preserve">│   │   </w:t>
-      </w:r>
-      <w:r>
-        <w:rPr>
-          <w:rFonts w:ascii="MS Gothic" w:eastAsia="MS Gothic" w:hAnsi="MS Gothic" w:cs="MS Gothic" w:hint="eastAsia"/>
-        </w:rPr>
-        <w:t>├</w:t>
-      </w:r>
-      <w:r>
-        <w:rPr>
-          <w:rFonts w:ascii="Calibri" w:hAnsi="Calibri" w:cs="Calibri"/>
-        </w:rPr>
-        <w:t>──</w:t>
-      </w:r>
-      <w:r>
-        <w:t xml:space="preserve"> responses.py</w:t>
-      </w:r>
-    </w:p>
-    <w:p>
-      <w:r>
-        <w:lastRenderedPageBreak/>
-        <w:t>│   │   └── constants.py</w:t>
-      </w:r>
-    </w:p>
-    <w:p>
-      <w:r>
-        <w:t>│   │</w:t>
-      </w:r>
-    </w:p>
-    <w:p>
-      <w:r>
-        <w:t xml:space="preserve">│   </w:t>
-      </w:r>
-      <w:r>
-        <w:rPr>
-          <w:rFonts w:ascii="MS Gothic" w:eastAsia="MS Gothic" w:hAnsi="MS Gothic" w:cs="MS Gothic" w:hint="eastAsia"/>
-        </w:rPr>
-        <w:t>├</w:t>
-      </w:r>
-      <w:r>
-        <w:rPr>
-          <w:rFonts w:ascii="Calibri" w:hAnsi="Calibri" w:cs="Calibri"/>
-        </w:rPr>
-        <w:t>──</w:t>
-      </w:r>
-      <w:r>
-        <w:t xml:space="preserve"> utils/</w:t>
-      </w:r>
-    </w:p>
-    <w:p>
-      <w:r>
-        <w:t xml:space="preserve">│   │   </w:t>
-      </w:r>
-      <w:r>
-        <w:rPr>
-          <w:rFonts w:ascii="MS Gothic" w:eastAsia="MS Gothic" w:hAnsi="MS Gothic" w:cs="MS Gothic" w:hint="eastAsia"/>
-        </w:rPr>
-        <w:t>├</w:t>
-      </w:r>
-      <w:r>
-        <w:rPr>
-          <w:rFonts w:ascii="Calibri" w:hAnsi="Calibri" w:cs="Calibri"/>
-        </w:rPr>
-        <w:t>──</w:t>
-      </w:r>
-      <w:r>
-        <w:t xml:space="preserve"> helpers.py</w:t>
-      </w:r>
-    </w:p>
-    <w:p>
-      <w:r>
-        <w:t xml:space="preserve">│   │   </w:t>
-      </w:r>
-      <w:r>
-        <w:rPr>
-          <w:rFonts w:ascii="MS Gothic" w:eastAsia="MS Gothic" w:hAnsi="MS Gothic" w:cs="MS Gothic" w:hint="eastAsia"/>
-        </w:rPr>
-        <w:t>├</w:t>
-      </w:r>
-      <w:r>
-        <w:rPr>
-          <w:rFonts w:ascii="Calibri" w:hAnsi="Calibri" w:cs="Calibri"/>
-        </w:rPr>
-        <w:t>──</w:t>
-      </w:r>
-      <w:r>
-        <w:t xml:space="preserve"> validators.py</w:t>
-      </w:r>
-    </w:p>
-    <w:p>
-      <w:r>
-        <w:t xml:space="preserve">│   │   </w:t>
-      </w:r>
-      <w:r>
-        <w:rPr>
-          <w:rFonts w:ascii="MS Gothic" w:eastAsia="MS Gothic" w:hAnsi="MS Gothic" w:cs="MS Gothic" w:hint="eastAsia"/>
-        </w:rPr>
-        <w:t>├</w:t>
-      </w:r>
-      <w:r>
-        <w:rPr>
-          <w:rFonts w:ascii="Calibri" w:hAnsi="Calibri" w:cs="Calibri"/>
-        </w:rPr>
-        <w:t>──</w:t>
-      </w:r>
-      <w:r>
-        <w:t xml:space="preserve"> file_upload.py</w:t>
-      </w:r>
-    </w:p>
-    <w:p>
-      <w:r>
-        <w:t>│   │   └── email.py</w:t>
-      </w:r>
-    </w:p>
-    <w:p>
-      <w:r>
-        <w:t>│   │</w:t>
-      </w:r>
-    </w:p>
-    <w:p>
-      <w:r>
-        <w:t xml:space="preserve">│   </w:t>
-      </w:r>
-      <w:r>
-        <w:rPr>
-          <w:rFonts w:ascii="MS Gothic" w:eastAsia="MS Gothic" w:hAnsi="MS Gothic" w:cs="MS Gothic" w:hint="eastAsia"/>
-        </w:rPr>
-        <w:t>├</w:t>
-      </w:r>
-      <w:r>
-        <w:rPr>
-          <w:rFonts w:ascii="Calibri" w:hAnsi="Calibri" w:cs="Calibri"/>
-        </w:rPr>
-        <w:t>──</w:t>
-      </w:r>
-      <w:r>
-        <w:t xml:space="preserve"> tests/</w:t>
-      </w:r>
-    </w:p>
-    <w:p>
-      <w:r>
-        <w:t>│   │</w:t>
-      </w:r>
-    </w:p>
-    <w:p>
-      <w:r>
         <w:t>│   └── main.py</w:t>
       </w:r>
     </w:p>
@@ -1038,19 +966,11 @@
         <w:rPr>
           <w:rFonts w:ascii="Calibri" w:hAnsi="Calibri" w:cs="Calibri"/>
         </w:rPr>
-        <w:t>─</w:t>
-      </w:r>
-      <w:proofErr w:type="gramStart"/>
-      <w:r>
-        <w:rPr>
-          <w:rFonts w:ascii="Calibri" w:hAnsi="Calibri" w:cs="Calibri"/>
-        </w:rPr>
-        <w:t>─</w:t>
+        <w:t>──</w:t>
       </w:r>
       <w:r>
         <w:t xml:space="preserve"> .env</w:t>
       </w:r>
-      <w:proofErr w:type="gramEnd"/>
     </w:p>
     <w:p>
       <w:r>
@@ -1083,35 +1003,25 @@
         <w:t>──</w:t>
       </w:r>
       <w:r>
-        <w:t xml:space="preserve"> </w:t>
-      </w:r>
-      <w:proofErr w:type="spellStart"/>
-      <w:r>
-        <w:t>Dockerfile</w:t>
-      </w:r>
-      <w:proofErr w:type="spellEnd"/>
-    </w:p>
-    <w:p>
-      <w:r>
-        <w:rPr>
-          <w:rFonts w:ascii="MS Gothic" w:eastAsia="MS Gothic" w:hAnsi="MS Gothic" w:cs="MS Gothic" w:hint="eastAsia"/>
-        </w:rPr>
-        <w:t>├</w:t>
-      </w:r>
-      <w:r>
-        <w:rPr>
-          <w:rFonts w:ascii="Calibri" w:hAnsi="Calibri" w:cs="Calibri"/>
-        </w:rPr>
-        <w:t>──</w:t>
-      </w:r>
-      <w:r>
-        <w:t xml:space="preserve"> docker-</w:t>
-      </w:r>
-      <w:proofErr w:type="spellStart"/>
-      <w:r>
-        <w:t>compose.yml</w:t>
-      </w:r>
-      <w:proofErr w:type="spellEnd"/>
+        <w:t xml:space="preserve"> Dockerfile</w:t>
+      </w:r>
+    </w:p>
+    <w:p>
+      <w:r>
+        <w:rPr>
+          <w:rFonts w:ascii="MS Gothic" w:eastAsia="MS Gothic" w:hAnsi="MS Gothic" w:cs="MS Gothic" w:hint="eastAsia"/>
+        </w:rPr>
+        <w:t>├</w:t>
+      </w:r>
+      <w:r>
+        <w:rPr>
+          <w:rFonts w:ascii="Calibri" w:hAnsi="Calibri" w:cs="Calibri"/>
+        </w:rPr>
+        <w:t>──</w:t>
+      </w:r>
+      <w:r>
+        <w:t xml:space="preserve"> docker-compose.yml</w:t>
+      </w:r>
     </w:p>
     <w:p>
       <w:r>

</xml_diff>